<commit_message>
Dokumantasyon: bugunku uctan uca debug oturumunu rapora/makaleye ekle
DEBUG_NOTES.md: 4 bug'in bulunuş sirasini ve fix'lerini detaylandiran
oturum log'u eklendi, acik kalan softmax per-row sorunu not edildi.

Yonga_Attention_Engine_Report.docx: Section 6 (Integration) bugunku
4 bug'i anlatan yeni paragrafla genisletildi, Section 7 (Current
Limitations) guncel duruma gore iki madde ile guncellendi.

linkedin_article.md: "Then we actually ran the whole chip, and it
found four more bugs" bolumu eklendi, "What's still open" guncellendi.
</commit_message>
<xml_diff>
--- a/article/Yonga_Attention_Engine_Report.docx
+++ b/article/Yonga_Attention_Engine_Report.docx
@@ -2402,6 +2402,18 @@
       </w:r>
     </w:p>
     <w:p>
+      <w:pPr/>
+      <w:r>
+        <w:rPr>
+          <w:rFonts w:ascii="Times New Roman" w:hAnsi="Times New Roman"/>
+          <w:b w:val="0"/>
+          <w:i w:val="0"/>
+          <w:sz w:val="22"/>
+        </w:rPr>
+        <w:t>A first full top-level simulation, driving four tokens through the assembled pipeline end to end rather than exercising each module in isolation, surfaced four further integration bugs that no single module's testbench could have caught. dbuf.sv discarded every packet's final element, because its bank-swap condition and its data-write condition were written as mutually exclusive branches of the same if/else even though both conditions are true on the same cycle. The ping-pong controller's read state machine advanced past its last requested address without confirming that address's result had actually been accepted downstream, silently losing it under backpressure. An arbiter's readiness signal back to softmax was wired behind a register that only became valid after softmax had already produced an output, a circular dependency that left softmax permanently waiting for permission to produce its first result. And softmax's own normalization multiplier lacked the single-element-in-flight guard already present in the scale/mask stage, letting a second result overwrite an unconsumed first one. With all four fixed, the assembled design now runs the full token-in-to-softmax-out path to completion without hanging or losing data.</w:t>
+      </w:r>
+    </w:p>
+    <w:p>
       <w:pPr>
         <w:keepNext/>
         <w:spacing w:before="400" w:after="160"/>
@@ -2466,10 +2478,21 @@
       <w:r>
         <w:rPr>
           <w:rFonts w:ascii="Times New Roman" w:hAnsi="Times New Roman"/>
-          <w:color w:val="000000"/>
           <w:sz w:val="22"/>
         </w:rPr>
-        <w:t>End-to-end, multi-token throughput on hardware has not yet been measured: current verification is per-module, in simulation.</w:t>
+        <w:t>A full end-to-end simulation of the assembled top-level design has now been run to completion (four tokens, Q·Kᵀ through softmax) without hanging or losing data, closing the top-level integration gap noted above; multi-token throughput on real hardware, as opposed to simulation, is still unmeasured.</w:t>
+      </w:r>
+    </w:p>
+    <w:p>
+      <w:pPr>
+        <w:pStyle w:val="ListBullet"/>
+      </w:pPr>
+      <w:r>
+        <w:rPr>
+          <w:rFonts w:ascii="Times New Roman" w:hAnsi="Times New Roman"/>
+          <w:sz w:val="22"/>
+        </w:rPr>
+        <w:t>softmax currently normalizes the entire flattened score matrix as a single row rather than one row per query, because the systolic array's output drain only asserts its end-of-row signal once for the whole matrix instead of once per row. The fix was attempted and reverted after it introduced a second, not-yet-diagnosed deadlock between softmax and the array drain, so normalized attention weights are not yet numerically correct even though the pipeline completes without hanging.</w:t>
       </w:r>
     </w:p>
     <w:p/>

</xml_diff>